<commit_message>
Restructure MS doc §2 with EDA intro and per-variant sections.
Replace Variant-A-only architecture overview with EDA microsegmentation
intro (§2.1–2.2), lab topology (§2.3), and variants A–G (§2.4–2.10).
Generalise §3–§6, split §4 endpoints by variant, dedupe §12, fix §13/§14
numbering, and fix UTF-8 encoding. Sync README, variant catalog, Word docs.
</commit_message>
<xml_diff>
--- a/docs/EDA-Microsegmentation-Test-Report.docx
+++ b/docs/EDA-Microsegmentation-Test-Report.docx
@@ -238,6 +238,43 @@
       </w:r>
       <w:r>
         <w:t xml:space="preserve">; never span all eight leaves.</w:t>
+      </w:r>
+    </w:p>
+    <w:p>
+      <w:pPr>
+        <w:pStyle w:val="BodyText"/>
+      </w:pPr>
+      <w:r>
+        <w:rPr>
+          <w:bCs/>
+          <w:b/>
+        </w:rPr>
+        <w:t xml:space="preserve">Architecture / per-variant guide:</w:t>
+      </w:r>
+      <w:r>
+        <w:t xml:space="preserve"> </w:t>
+      </w:r>
+      <w:r>
+        <w:rPr>
+          <w:rStyle w:val="VerbatimChar"/>
+        </w:rPr>
+        <w:t xml:space="preserve">docs/EDA-Microsegmentation.md</w:t>
+      </w:r>
+      <w:r>
+        <w:t xml:space="preserve"> </w:t>
+      </w:r>
+      <w:r>
+        <w:rPr>
+          <w:bCs/>
+          <w:b/>
+        </w:rPr>
+        <w:t xml:space="preserve">§2</w:t>
+      </w:r>
+      <w:r>
+        <w:t xml:space="preserve"> </w:t>
+      </w:r>
+      <w:r>
+        <w:t xml:space="preserve">(EDA intro + variants A–G).</w:t>
       </w:r>
     </w:p>
     <w:p>

</xml_diff>

<commit_message>
Apply Word review comments to MS documentation.
</commit_message>
<xml_diff>
--- a/docs/EDA-Microsegmentation-Test-Report.docx
+++ b/docs/EDA-Microsegmentation-Test-Report.docx
@@ -67,16 +67,32 @@
         <w:t xml:space="preserve"> </w:t>
       </w:r>
       <w:r>
+        <w:t xml:space="preserve">26.4.2 (</w:t>
+      </w:r>
+      <w:r>
         <w:rPr>
           <w:rStyle w:val="VerbatimChar"/>
         </w:rPr>
         <w:t xml:space="preserve">kind-eda-demo-wsl2</w:t>
       </w:r>
       <w:r>
-        <w:t xml:space="preserve"> </w:t>
-      </w:r>
-      <w:r>
-        <w:t xml:space="preserve">— https://127.0.0.1:9443</w:t>
+        <w:t xml:space="preserve">) — https://127.0.0.1:9443</w:t>
+      </w:r>
+      <w:r>
+        <w:br/>
+      </w:r>
+      <w:r>
+        <w:rPr>
+          <w:bCs/>
+          <w:b/>
+        </w:rPr>
+        <w:t xml:space="preserve">Microsegmentation app:</w:t>
+      </w:r>
+      <w:r>
+        <w:t xml:space="preserve"> </w:t>
+      </w:r>
+      <w:r>
+        <w:t xml:space="preserve">6.0.2</w:t>
       </w:r>
       <w:r>
         <w:br/>
@@ -354,7 +370,7 @@
               <w:jc w:val="left"/>
             </w:pPr>
             <w:r>
-              <w:t xml:space="preserve">Result</w:t>
+              <w:t xml:space="preserve">Status</w:t>
             </w:r>
           </w:p>
         </w:tc>
@@ -384,37 +400,37 @@
                 <w:bCs/>
                 <w:b/>
               </w:rPr>
-              <w:t xml:space="preserve">D</w:t>
+              <w:t xml:space="preserve">A</w:t>
             </w:r>
             <w:r>
               <w:t xml:space="preserve"> </w:t>
             </w:r>
             <w:r>
-              <w:t xml:space="preserve">IRB</w:t>
-            </w:r>
-          </w:p>
-        </w:tc>
-        <w:tc>
-          <w:tcPr/>
-          <w:p>
-            <w:pPr>
-              <w:pStyle w:val="Compact"/>
-              <w:jc w:val="left"/>
-            </w:pPr>
-            <w:r>
-              <w:t xml:space="preserve">leaf-2/3/4</w:t>
-            </w:r>
-          </w:p>
-        </w:tc>
-        <w:tc>
-          <w:tcPr/>
-          <w:p>
-            <w:pPr>
-              <w:pStyle w:val="Compact"/>
-              <w:jc w:val="left"/>
-            </w:pPr>
-            <w:r>
-              <w:t xml:space="preserve">IRB + VLAN helpers</w:t>
+              <w:t xml:space="preserve">VLAN</w:t>
+            </w:r>
+          </w:p>
+        </w:tc>
+        <w:tc>
+          <w:tcPr/>
+          <w:p>
+            <w:pPr>
+              <w:pStyle w:val="Compact"/>
+              <w:jc w:val="left"/>
+            </w:pPr>
+            <w:r>
+              <w:t xml:space="preserve">leaf-1/2/3</w:t>
+            </w:r>
+          </w:p>
+        </w:tc>
+        <w:tc>
+          <w:tcPr/>
+          <w:p>
+            <w:pPr>
+              <w:pStyle w:val="Compact"/>
+              <w:jc w:val="left"/>
+            </w:pPr>
+            <w:r>
+              <w:t xml:space="preserve">VLAN</w:t>
             </w:r>
           </w:p>
         </w:tc>
@@ -430,28 +446,19 @@
                 <w:bCs/>
                 <w:b/>
               </w:rPr>
-              <w:t xml:space="preserve">GO</w:t>
-            </w:r>
-          </w:p>
-        </w:tc>
-        <w:tc>
-          <w:tcPr/>
-          <w:p>
-            <w:pPr>
-              <w:pStyle w:val="Compact"/>
-              <w:jc w:val="left"/>
-            </w:pPr>
-            <w:r>
-              <w:t xml:space="preserve">Full GBP matrix after 4-entry</w:t>
-            </w:r>
-            <w:r>
-              <w:t xml:space="preserve"> </w:t>
-            </w:r>
-            <w:r>
-              <w:rPr>
-                <w:rStyle w:val="VerbatimChar"/>
-              </w:rPr>
-              <w:t xml:space="preserve">ms-assoc-irb</w:t>
+              <w:t xml:space="preserve">Validated</w:t>
+            </w:r>
+          </w:p>
+        </w:tc>
+        <w:tc>
+          <w:tcPr/>
+          <w:p>
+            <w:pPr>
+              <w:pStyle w:val="Compact"/>
+              <w:jc w:val="left"/>
+            </w:pPr>
+            <w:r>
+              <w:t xml:space="preserve">July 2026 baseline</w:t>
             </w:r>
           </w:p>
         </w:tc>
@@ -469,37 +476,37 @@
                 <w:bCs/>
                 <w:b/>
               </w:rPr>
-              <w:t xml:space="preserve">E</w:t>
+              <w:t xml:space="preserve">B</w:t>
             </w:r>
             <w:r>
               <w:t xml:space="preserve"> </w:t>
             </w:r>
             <w:r>
-              <w:t xml:space="preserve">StaticRoute</w:t>
-            </w:r>
-          </w:p>
-        </w:tc>
-        <w:tc>
-          <w:tcPr/>
-          <w:p>
-            <w:pPr>
-              <w:pStyle w:val="Compact"/>
-              <w:jc w:val="left"/>
-            </w:pPr>
-            <w:r>
-              <w:t xml:space="preserve">leaf-6/7/8</w:t>
-            </w:r>
-          </w:p>
-        </w:tc>
-        <w:tc>
-          <w:tcPr/>
-          <w:p>
-            <w:pPr>
-              <w:pStyle w:val="Compact"/>
-              <w:jc w:val="left"/>
-            </w:pPr>
-            <w:r>
-              <w:t xml:space="preserve">StaticRoute + VLAN</w:t>
+              <w:t xml:space="preserve">BridgeInterface</w:t>
+            </w:r>
+          </w:p>
+        </w:tc>
+        <w:tc>
+          <w:tcPr/>
+          <w:p>
+            <w:pPr>
+              <w:pStyle w:val="Compact"/>
+              <w:jc w:val="left"/>
+            </w:pPr>
+            <w:r>
+              <w:t xml:space="preserve">leaf-5/6/7</w:t>
+            </w:r>
+          </w:p>
+        </w:tc>
+        <w:tc>
+          <w:tcPr/>
+          <w:p>
+            <w:pPr>
+              <w:pStyle w:val="Compact"/>
+              <w:jc w:val="left"/>
+            </w:pPr>
+            <w:r>
+              <w:t xml:space="preserve">BridgeInterface (explicit BI names)</w:t>
             </w:r>
           </w:p>
         </w:tc>
@@ -515,32 +522,16 @@
                 <w:bCs/>
                 <w:b/>
               </w:rPr>
-              <w:t xml:space="preserve">GO</w:t>
-            </w:r>
-          </w:p>
-        </w:tc>
-        <w:tc>
-          <w:tcPr/>
-          <w:p>
-            <w:pPr>
-              <w:pStyle w:val="Compact"/>
-              <w:jc w:val="left"/>
-            </w:pPr>
-            <w:r>
-              <w:t xml:space="preserve">Includes red→</w:t>
-            </w:r>
-            <w:r>
-              <w:rPr>
-                <w:rStyle w:val="VerbatimChar"/>
-              </w:rPr>
-              <w:t xml:space="preserve">172.16.91.1</w:t>
-            </w:r>
-            <w:r>
-              <w:t xml:space="preserve"> </w:t>
-            </w:r>
-            <w:r>
-              <w:t xml:space="preserve">static-prefix deny</w:t>
-            </w:r>
+              <w:t xml:space="preserve">Validated</w:t>
+            </w:r>
+          </w:p>
+        </w:tc>
+        <w:tc>
+          <w:tcPr/>
+          <w:p>
+            <w:pPr>
+              <w:pStyle w:val="Compact"/>
+            </w:pPr>
           </w:p>
         </w:tc>
       </w:tr>
@@ -603,19 +594,25 @@
                 <w:bCs/>
                 <w:b/>
               </w:rPr>
-              <w:t xml:space="preserve">PARKED</w:t>
-            </w:r>
-          </w:p>
-        </w:tc>
-        <w:tc>
-          <w:tcPr/>
-          <w:p>
-            <w:pPr>
-              <w:pStyle w:val="Compact"/>
-              <w:jc w:val="left"/>
-            </w:pPr>
-            <w:r>
-              <w:t xml:space="preserve">Policy on → all cross-subnet fails (platform?)</w:t>
+              <w:t xml:space="preserve">Failed</w:t>
+            </w:r>
+            <w:r>
+              <w:t xml:space="preserve"> </w:t>
+            </w:r>
+            <w:r>
+              <w:t xml:space="preserve">(under investigation)</w:t>
+            </w:r>
+          </w:p>
+        </w:tc>
+        <w:tc>
+          <w:tcPr/>
+          <w:p>
+            <w:pPr>
+              <w:pStyle w:val="Compact"/>
+              <w:jc w:val="left"/>
+            </w:pPr>
+            <w:r>
+              <w:t xml:space="preserve">Policy on → all cross-subnet fails</w:t>
             </w:r>
           </w:p>
         </w:tc>
@@ -633,37 +630,37 @@
                 <w:bCs/>
                 <w:b/>
               </w:rPr>
-              <w:t xml:space="preserve">A</w:t>
+              <w:t xml:space="preserve">D</w:t>
             </w:r>
             <w:r>
               <w:t xml:space="preserve"> </w:t>
             </w:r>
             <w:r>
-              <w:t xml:space="preserve">VLAN</w:t>
-            </w:r>
-          </w:p>
-        </w:tc>
-        <w:tc>
-          <w:tcPr/>
-          <w:p>
-            <w:pPr>
-              <w:pStyle w:val="Compact"/>
-              <w:jc w:val="left"/>
-            </w:pPr>
-            <w:r>
-              <w:t xml:space="preserve">leaf-1/2/3</w:t>
-            </w:r>
-          </w:p>
-        </w:tc>
-        <w:tc>
-          <w:tcPr/>
-          <w:p>
-            <w:pPr>
-              <w:pStyle w:val="Compact"/>
-              <w:jc w:val="left"/>
-            </w:pPr>
-            <w:r>
-              <w:t xml:space="preserve">VLAN</w:t>
+              <w:t xml:space="preserve">IRB</w:t>
+            </w:r>
+          </w:p>
+        </w:tc>
+        <w:tc>
+          <w:tcPr/>
+          <w:p>
+            <w:pPr>
+              <w:pStyle w:val="Compact"/>
+              <w:jc w:val="left"/>
+            </w:pPr>
+            <w:r>
+              <w:t xml:space="preserve">leaf-2/3/4</w:t>
+            </w:r>
+          </w:p>
+        </w:tc>
+        <w:tc>
+          <w:tcPr/>
+          <w:p>
+            <w:pPr>
+              <w:pStyle w:val="Compact"/>
+              <w:jc w:val="left"/>
+            </w:pPr>
+            <w:r>
+              <w:t xml:space="preserve">IRB + VLAN helpers</w:t>
             </w:r>
           </w:p>
         </w:tc>
@@ -679,25 +676,28 @@
                 <w:bCs/>
                 <w:b/>
               </w:rPr>
-              <w:t xml:space="preserve">GO</w:t>
+              <w:t xml:space="preserve">Validated</w:t>
+            </w:r>
+          </w:p>
+        </w:tc>
+        <w:tc>
+          <w:tcPr/>
+          <w:p>
+            <w:pPr>
+              <w:pStyle w:val="Compact"/>
+              <w:jc w:val="left"/>
+            </w:pPr>
+            <w:r>
+              <w:t xml:space="preserve">Full GBP matrix after 4-entry</w:t>
             </w:r>
             <w:r>
               <w:t xml:space="preserve"> </w:t>
             </w:r>
             <w:r>
-              <w:t xml:space="preserve">(historical)</w:t>
-            </w:r>
-          </w:p>
-        </w:tc>
-        <w:tc>
-          <w:tcPr/>
-          <w:p>
-            <w:pPr>
-              <w:pStyle w:val="Compact"/>
-              <w:jc w:val="left"/>
-            </w:pPr>
-            <w:r>
-              <w:t xml:space="preserve">July 2026 baseline</w:t>
+              <w:rPr>
+                <w:rStyle w:val="VerbatimChar"/>
+              </w:rPr>
+              <w:t xml:space="preserve">ms-assoc-irb</w:t>
             </w:r>
           </w:p>
         </w:tc>
@@ -715,31 +715,37 @@
                 <w:bCs/>
                 <w:b/>
               </w:rPr>
-              <w:t xml:space="preserve">B, F, G</w:t>
-            </w:r>
-          </w:p>
-        </w:tc>
-        <w:tc>
-          <w:tcPr/>
-          <w:p>
-            <w:pPr>
-              <w:pStyle w:val="Compact"/>
-              <w:jc w:val="left"/>
-            </w:pPr>
-            <w:r>
-              <w:t xml:space="preserve">catalog</w:t>
-            </w:r>
-          </w:p>
-        </w:tc>
-        <w:tc>
-          <w:tcPr/>
-          <w:p>
-            <w:pPr>
-              <w:pStyle w:val="Compact"/>
-              <w:jc w:val="left"/>
-            </w:pPr>
-            <w:r>
-              <w:t xml:space="preserve">various</w:t>
+              <w:t xml:space="preserve">E</w:t>
+            </w:r>
+            <w:r>
+              <w:t xml:space="preserve"> </w:t>
+            </w:r>
+            <w:r>
+              <w:t xml:space="preserve">StaticRoute</w:t>
+            </w:r>
+          </w:p>
+        </w:tc>
+        <w:tc>
+          <w:tcPr/>
+          <w:p>
+            <w:pPr>
+              <w:pStyle w:val="Compact"/>
+              <w:jc w:val="left"/>
+            </w:pPr>
+            <w:r>
+              <w:t xml:space="preserve">leaf-6/7/8</w:t>
+            </w:r>
+          </w:p>
+        </w:tc>
+        <w:tc>
+          <w:tcPr/>
+          <w:p>
+            <w:pPr>
+              <w:pStyle w:val="Compact"/>
+              <w:jc w:val="left"/>
+            </w:pPr>
+            <w:r>
+              <w:t xml:space="preserve">StaticRoute + VLAN</w:t>
             </w:r>
           </w:p>
         </w:tc>
@@ -755,19 +761,167 @@
                 <w:bCs/>
                 <w:b/>
               </w:rPr>
-              <w:t xml:space="preserve">Not re-validated</w:t>
-            </w:r>
-          </w:p>
-        </w:tc>
-        <w:tc>
-          <w:tcPr/>
-          <w:p>
-            <w:pPr>
-              <w:pStyle w:val="Compact"/>
-              <w:jc w:val="left"/>
-            </w:pPr>
-            <w:r>
-              <w:t xml:space="preserve">See §6 historical run</w:t>
+              <w:t xml:space="preserve">Validated</w:t>
+            </w:r>
+          </w:p>
+        </w:tc>
+        <w:tc>
+          <w:tcPr/>
+          <w:p>
+            <w:pPr>
+              <w:pStyle w:val="Compact"/>
+              <w:jc w:val="left"/>
+            </w:pPr>
+            <w:r>
+              <w:t xml:space="preserve">Prefix deny via blackhole route — not tested to actual remote host</w:t>
+            </w:r>
+          </w:p>
+        </w:tc>
+      </w:tr>
+      <w:tr>
+        <w:tc>
+          <w:tcPr/>
+          <w:p>
+            <w:pPr>
+              <w:pStyle w:val="Compact"/>
+              <w:jc w:val="left"/>
+            </w:pPr>
+            <w:r>
+              <w:rPr>
+                <w:bCs/>
+                <w:b/>
+              </w:rPr>
+              <w:t xml:space="preserve">F</w:t>
+            </w:r>
+            <w:r>
+              <w:t xml:space="preserve"> </w:t>
+            </w:r>
+            <w:r>
+              <w:t xml:space="preserve">Router enf.</w:t>
+            </w:r>
+          </w:p>
+        </w:tc>
+        <w:tc>
+          <w:tcPr/>
+          <w:p>
+            <w:pPr>
+              <w:pStyle w:val="Compact"/>
+              <w:jc w:val="left"/>
+            </w:pPr>
+            <w:r>
+              <w:t xml:space="preserve">leaf-5/6/7</w:t>
+            </w:r>
+          </w:p>
+        </w:tc>
+        <w:tc>
+          <w:tcPr/>
+          <w:p>
+            <w:pPr>
+              <w:pStyle w:val="Compact"/>
+              <w:jc w:val="left"/>
+            </w:pPr>
+            <w:r>
+              <w:t xml:space="preserve">VLAN</w:t>
+            </w:r>
+          </w:p>
+        </w:tc>
+        <w:tc>
+          <w:tcPr/>
+          <w:p>
+            <w:pPr>
+              <w:pStyle w:val="Compact"/>
+              <w:jc w:val="left"/>
+            </w:pPr>
+            <w:r>
+              <w:rPr>
+                <w:bCs/>
+                <w:b/>
+              </w:rPr>
+              <w:t xml:space="preserve">Not currently validated</w:t>
+            </w:r>
+          </w:p>
+        </w:tc>
+        <w:tc>
+          <w:tcPr/>
+          <w:p>
+            <w:pPr>
+              <w:pStyle w:val="Compact"/>
+            </w:pPr>
+          </w:p>
+        </w:tc>
+      </w:tr>
+      <w:tr>
+        <w:tc>
+          <w:tcPr/>
+          <w:p>
+            <w:pPr>
+              <w:pStyle w:val="Compact"/>
+              <w:jc w:val="left"/>
+            </w:pPr>
+            <w:r>
+              <w:rPr>
+                <w:bCs/>
+                <w:b/>
+              </w:rPr>
+              <w:t xml:space="preserve">G</w:t>
+            </w:r>
+            <w:r>
+              <w:t xml:space="preserve"> </w:t>
+            </w:r>
+            <w:r>
+              <w:t xml:space="preserve">BD enf.</w:t>
+            </w:r>
+          </w:p>
+        </w:tc>
+        <w:tc>
+          <w:tcPr/>
+          <w:p>
+            <w:pPr>
+              <w:pStyle w:val="Compact"/>
+              <w:jc w:val="left"/>
+            </w:pPr>
+            <w:r>
+              <w:t xml:space="preserve">leaf-5/6/7</w:t>
+            </w:r>
+          </w:p>
+        </w:tc>
+        <w:tc>
+          <w:tcPr/>
+          <w:p>
+            <w:pPr>
+              <w:pStyle w:val="Compact"/>
+              <w:jc w:val="left"/>
+            </w:pPr>
+            <w:r>
+              <w:t xml:space="preserve">VLAN</w:t>
+            </w:r>
+          </w:p>
+        </w:tc>
+        <w:tc>
+          <w:tcPr/>
+          <w:p>
+            <w:pPr>
+              <w:pStyle w:val="Compact"/>
+              <w:jc w:val="left"/>
+            </w:pPr>
+            <w:r>
+              <w:rPr>
+                <w:bCs/>
+                <w:b/>
+              </w:rPr>
+              <w:t xml:space="preserve">Not currently validated</w:t>
+            </w:r>
+          </w:p>
+        </w:tc>
+        <w:tc>
+          <w:tcPr/>
+          <w:p>
+            <w:pPr>
+              <w:pStyle w:val="Compact"/>
+              <w:jc w:val="left"/>
+            </w:pPr>
+            <w:r>
+              <w:t xml:space="preserve">L2 only</w:t>
             </w:r>
           </w:p>
         </w:tc>

</xml_diff>